<commit_message>
Add generated files from README
</commit_message>
<xml_diff>
--- a/output/Martin_Miller_resume.docx
+++ b/output/Martin_Miller_resume.docx
@@ -2,7 +2,7 @@
 <file path=word/document.xml><?xml version="1.0" encoding="utf-8"?>
 <w:document xmlns:w="http://schemas.openxmlformats.org/wordprocessingml/2006/main" xmlns:m="http://schemas.openxmlformats.org/officeDocument/2006/math" xmlns:r="http://schemas.openxmlformats.org/officeDocument/2006/relationships" xmlns:o="urn:schemas-microsoft-com:office:office" xmlns:v="urn:schemas-microsoft-com:vml" xmlns:w10="urn:schemas-microsoft-com:office:word" xmlns:a="http://schemas.openxmlformats.org/drawingml/2006/main" xmlns:pic="http://schemas.openxmlformats.org/drawingml/2006/picture" xmlns:wp="http://schemas.openxmlformats.org/drawingml/2006/wordprocessingDrawing">
   <w:body>
-    <w:bookmarkStart w:id="61" w:name="martin-l.-miller"/>
+    <w:bookmarkStart w:id="47" w:name="martin-l.-miller"/>
     <w:p>
       <w:pPr>
         <w:pStyle w:val="Heading1"/>
@@ -64,7 +64,7 @@
         </w:r>
       </w:hyperlink>
     </w:p>
-    <w:bookmarkStart w:id="23" w:name="mernlamp-full-stack-developer"/>
+    <w:bookmarkStart w:id="46" w:name="mernlamp-full-stack-developer"/>
     <w:p>
       <w:pPr>
         <w:pStyle w:val="Heading2"/>
@@ -81,41 +81,185 @@
         <w:t xml:space="preserve">Experienced Full Stack Developer with expertise in crafting innovative solutions that drive business growth. Adept at optimizing workflows, enhancing and automating system efficiencies, and delivering high-impact digital experiences, blending technical expertise with a creative approach to problem-solving. Passionate about continuous learning, with a strong ability to think strategically and creatively while maintaining meticulous attention to detail. Skilled, personal communicator and relationship builder who enjoys educating juniors and peers.</w:t>
       </w:r>
     </w:p>
+    <w:bookmarkStart w:id="23" w:name="technical-proficiencies"/>
+    <w:p>
+      <w:pPr>
+        <w:pStyle w:val="Heading3"/>
+      </w:pPr>
+      <w:r>
+        <w:rPr>
+          <w:bCs/>
+          <w:b/>
+        </w:rPr>
+        <w:t xml:space="preserve">Technical Proficiencies</w:t>
+      </w:r>
+    </w:p>
+    <w:p>
+      <w:pPr>
+        <w:pStyle w:val="FirstParagraph"/>
+      </w:pPr>
+      <w:r>
+        <w:rPr>
+          <w:bCs/>
+          <w:b/>
+        </w:rPr>
+        <w:t xml:space="preserve">Languages and markup</w:t>
+      </w:r>
+      <w:r>
+        <w:t xml:space="preserve"> </w:t>
+      </w:r>
+      <w:r>
+        <w:t xml:space="preserve">JavaScript, TypeScript, Python, PHP, Liquid, HTML, CSS/SASS/LESS, XML, JSON, YAML, Bash/ZSH, markdown, Perl, MongoDB, MySQL/MariaDB, SVG, GraphQL, VB</w:t>
+      </w:r>
+      <w:r>
+        <w:br/>
+      </w:r>
+      <w:r>
+        <w:rPr>
+          <w:bCs/>
+          <w:b/>
+        </w:rPr>
+        <w:t xml:space="preserve">Cloud Platforms</w:t>
+      </w:r>
+      <w:r>
+        <w:t xml:space="preserve"> </w:t>
+      </w:r>
+      <w:r>
+        <w:t xml:space="preserve">Azure App Service, Azure DevOps, Digital Ocean, Heroku</w:t>
+      </w:r>
+      <w:r>
+        <w:br/>
+      </w:r>
+      <w:r>
+        <w:rPr>
+          <w:bCs/>
+          <w:b/>
+        </w:rPr>
+        <w:t xml:space="preserve">Frameworks/Libraries</w:t>
+      </w:r>
+      <w:r>
+        <w:t xml:space="preserve"> </w:t>
+      </w:r>
+      <w:r>
+        <w:t xml:space="preserve">Bootstrap, Foundation, Tailwind, Rivet (Indiana University CSS framework), Laravel, Magento, Node.js, React, ACF, Gutenberg, jQuery, d3.js, Highcharts</w:t>
+      </w:r>
+      <w:r>
+        <w:br/>
+      </w:r>
+      <w:r>
+        <w:rPr>
+          <w:bCs/>
+          <w:b/>
+        </w:rPr>
+        <w:t xml:space="preserve">Tools/CLI</w:t>
+      </w:r>
+      <w:r>
+        <w:t xml:space="preserve"> </w:t>
+      </w:r>
+      <w:r>
+        <w:t xml:space="preserve">git CLI, npm, yarn, Bower, Composer, Grunt, Gulp, Webpack, Vite, pip, Axios, Express, Bluebird, sed, awk, scp, rsync, ssh, vi, grep, cron, etc., Shopify CLI and APIs, WP-CLI, GitHub Actions, regex, Docker, REST, SOAP</w:t>
+      </w:r>
+      <w:r>
+        <w:br/>
+      </w:r>
+      <w:r>
+        <w:rPr>
+          <w:bCs/>
+          <w:b/>
+        </w:rPr>
+        <w:t xml:space="preserve">Software</w:t>
+      </w:r>
+      <w:r>
+        <w:t xml:space="preserve"> </w:t>
+      </w:r>
+      <w:r>
+        <w:t xml:space="preserve">Adobe Creative Suite, SharePoint, Figma, Jira, GitHub, HubSpot, Salesforce, Marketo, Eloqua, Apache, Nginx, VSCode, GA4, GSC, GTM</w:t>
+      </w:r>
+      <w:r>
+        <w:br/>
+      </w:r>
+      <w:r>
+        <w:rPr>
+          <w:bCs/>
+          <w:b/>
+        </w:rPr>
+        <w:t xml:space="preserve">OS</w:t>
+      </w:r>
+      <w:r>
+        <w:t xml:space="preserve"> </w:t>
+      </w:r>
+      <w:r>
+        <w:t xml:space="preserve">CentOS, Fedora, RHEL, Ubuntu, Debian, Raspbian, MacOS, Windows</w:t>
+      </w:r>
+      <w:r>
+        <w:br/>
+      </w:r>
+      <w:r>
+        <w:rPr>
+          <w:bCs/>
+          <w:b/>
+        </w:rPr>
+        <w:t xml:space="preserve">CMS/EComm</w:t>
+      </w:r>
+      <w:r>
+        <w:t xml:space="preserve"> </w:t>
+      </w:r>
+      <w:r>
+        <w:t xml:space="preserve">WordPress, WooCommerce, Magento, Shopify, Cascade</w:t>
+      </w:r>
+      <w:r>
+        <w:br/>
+      </w:r>
+      <w:r>
+        <w:rPr>
+          <w:bCs/>
+          <w:b/>
+        </w:rPr>
+        <w:t xml:space="preserve">Other Skills</w:t>
+      </w:r>
+      <w:r>
+        <w:t xml:space="preserve"> </w:t>
+      </w:r>
+      <w:r>
+        <w:t xml:space="preserve">SVG, CSS, and JavaScript Animation, a11y/WCAG compliant coding practices, clear communicator, Agile/Scrum</w:t>
+      </w:r>
+    </w:p>
     <w:bookmarkEnd w:id="23"/>
-    <w:bookmarkStart w:id="60" w:name="websites"/>
-    <w:p>
-      <w:pPr>
-        <w:pStyle w:val="Heading2"/>
-      </w:pPr>
-      <w:r>
-        <w:t xml:space="preserve">Websites</w:t>
-      </w:r>
-    </w:p>
-    <w:bookmarkStart w:id="34" w:name="wordpress"/>
+    <w:bookmarkStart w:id="45" w:name="professional-experiences"/>
     <w:p>
       <w:pPr>
         <w:pStyle w:val="Heading3"/>
       </w:pPr>
       <w:r>
-        <w:t xml:space="preserve">WordPress:</w:t>
-      </w:r>
-    </w:p>
-    <w:p>
-      <w:pPr>
-        <w:numPr>
-          <w:ilvl w:val="0"/>
-          <w:numId w:val="1001"/>
-        </w:numPr>
-        <w:pStyle w:val="Compact"/>
-      </w:pPr>
+        <w:rPr>
+          <w:bCs/>
+          <w:b/>
+        </w:rPr>
+        <w:t xml:space="preserve">Professional Experiences</w:t>
+      </w:r>
+    </w:p>
+    <w:bookmarkStart w:id="25" w:name="X6ae874e2bc6bc97ddc985f77c3f122a88b65921"/>
+    <w:p>
+      <w:pPr>
+        <w:pStyle w:val="Heading4"/>
+      </w:pPr>
+      <w:r>
+        <w:t xml:space="preserve">March 17, 2025 - September 17, 2025 | Web Developer |</w:t>
+      </w:r>
+      <w:r>
+        <w:t xml:space="preserve"> </w:t>
+      </w:r>
       <w:hyperlink r:id="rId24">
         <w:r>
           <w:rPr>
             <w:rStyle w:val="Hyperlink"/>
           </w:rPr>
-          <w:t xml:space="preserve">Ecumen</w:t>
+          <w:t xml:space="preserve">Indiana University</w:t>
         </w:r>
       </w:hyperlink>
+      <w:r>
+        <w:t xml:space="preserve">, Bloomington, Indiana (remote contract)</w:t>
+      </w:r>
     </w:p>
     <w:p>
       <w:pPr>
@@ -123,9 +267,472 @@
           <w:ilvl w:val="0"/>
           <w:numId w:val="1001"/>
         </w:numPr>
-        <w:pStyle w:val="Compact"/>
-      </w:pPr>
-      <w:hyperlink r:id="rId25">
+      </w:pPr>
+      <w:r>
+        <w:t xml:space="preserve">Developed bespoke reusable extensions for IU website(s) CMS (Cascade) for frontend display, using Velocity, HTML/CSS, XML, PHP, JavaScript, MS-SDK, MicroSoft Graph API, custom css for Highcharts animations</w:t>
+      </w:r>
+    </w:p>
+    <w:p>
+      <w:pPr>
+        <w:numPr>
+          <w:ilvl w:val="0"/>
+          <w:numId w:val="1001"/>
+        </w:numPr>
+      </w:pPr>
+      <w:r>
+        <w:t xml:space="preserve">Extensions included dynamic data visualization (Highcharts), WordPress blog feeds, SharePoint Lists (Azure MicroSoft Graph API and MS-SDK), LiveWhale Feeds (Calendars), dynamic custom JavaScript filters, and IU-hosted web framework automations</w:t>
+      </w:r>
+    </w:p>
+    <w:p>
+      <w:pPr>
+        <w:numPr>
+          <w:ilvl w:val="0"/>
+          <w:numId w:val="1001"/>
+        </w:numPr>
+      </w:pPr>
+      <w:r>
+        <w:t xml:space="preserve">Architected extension components best practices for implementation</w:t>
+      </w:r>
+    </w:p>
+    <w:p>
+      <w:pPr>
+        <w:numPr>
+          <w:ilvl w:val="0"/>
+          <w:numId w:val="1001"/>
+        </w:numPr>
+      </w:pPr>
+      <w:r>
+        <w:t xml:space="preserve">Extensive use of github actions and CI/CD deployment automations</w:t>
+      </w:r>
+    </w:p>
+    <w:bookmarkEnd w:id="25"/>
+    <w:bookmarkStart w:id="28" w:name="X354dad4a7b073b512086b0e0dcbfd71792b3a9d"/>
+    <w:p>
+      <w:pPr>
+        <w:pStyle w:val="Heading4"/>
+      </w:pPr>
+      <w:r>
+        <w:t xml:space="preserve">April 2022 - September 2024 | Lead Web Developer |</w:t>
+      </w:r>
+      <w:r>
+        <w:t xml:space="preserve"> </w:t>
+      </w:r>
+      <w:hyperlink r:id="rId26">
+        <w:r>
+          <w:rPr>
+            <w:rStyle w:val="Hyperlink"/>
+          </w:rPr>
+          <w:t xml:space="preserve">Merchology</w:t>
+        </w:r>
+      </w:hyperlink>
+      <w:r>
+        <w:t xml:space="preserve">, Plymouth, Minnesota</w:t>
+      </w:r>
+    </w:p>
+    <w:p>
+      <w:pPr>
+        <w:numPr>
+          <w:ilvl w:val="0"/>
+          <w:numId w:val="1002"/>
+        </w:numPr>
+      </w:pPr>
+      <w:r>
+        <w:t xml:space="preserve">Custom Shopify theme development for bespoke storefronts, including</w:t>
+      </w:r>
+      <w:r>
+        <w:t xml:space="preserve"> </w:t>
+      </w:r>
+      <w:hyperlink r:id="rId27">
+        <w:r>
+          <w:rPr>
+            <w:rStyle w:val="Hyperlink"/>
+          </w:rPr>
+          <w:t xml:space="preserve">BouGear</w:t>
+        </w:r>
+      </w:hyperlink>
+    </w:p>
+    <w:p>
+      <w:pPr>
+        <w:numPr>
+          <w:ilvl w:val="0"/>
+          <w:numId w:val="1002"/>
+        </w:numPr>
+      </w:pPr>
+      <w:r>
+        <w:t xml:space="preserve">Extensive usage of the Shopify Storefront and Admin APIs using a GraphQL interface</w:t>
+      </w:r>
+    </w:p>
+    <w:p>
+      <w:pPr>
+        <w:numPr>
+          <w:ilvl w:val="0"/>
+          <w:numId w:val="1002"/>
+        </w:numPr>
+      </w:pPr>
+      <w:r>
+        <w:t xml:space="preserve">Code maintenance, refactoring, documentation, and debugging. Overall reduction of technical debt</w:t>
+      </w:r>
+    </w:p>
+    <w:p>
+      <w:pPr>
+        <w:numPr>
+          <w:ilvl w:val="0"/>
+          <w:numId w:val="1002"/>
+        </w:numPr>
+      </w:pPr>
+      <w:r>
+        <w:t xml:space="preserve">Development of new website features and implemented a new UI, which led to an increase in conversions. Developed bespoke SVG and CSS animations for product selection and shipping options</w:t>
+      </w:r>
+    </w:p>
+    <w:p>
+      <w:pPr>
+        <w:numPr>
+          <w:ilvl w:val="0"/>
+          <w:numId w:val="1002"/>
+        </w:numPr>
+      </w:pPr>
+      <w:r>
+        <w:t xml:space="preserve">Developer team leadership and management, conducted reviews, stand-ups, and regular 1:1 meetings</w:t>
+      </w:r>
+    </w:p>
+    <w:p>
+      <w:pPr>
+        <w:numPr>
+          <w:ilvl w:val="0"/>
+          <w:numId w:val="1002"/>
+        </w:numPr>
+      </w:pPr>
+      <w:r>
+        <w:t xml:space="preserve">Through website improvements my efforts increased sales efficiency, reduced customer friction, and assisted sales growth from $50M to $72M over a two-year period</w:t>
+      </w:r>
+    </w:p>
+    <w:p>
+      <w:pPr>
+        <w:numPr>
+          <w:ilvl w:val="0"/>
+          <w:numId w:val="1002"/>
+        </w:numPr>
+      </w:pPr>
+      <w:r>
+        <w:t xml:space="preserve">Submitted and completed over 1000 Jira tickets during my tenure at Merchology</w:t>
+      </w:r>
+    </w:p>
+    <w:p>
+      <w:pPr>
+        <w:numPr>
+          <w:ilvl w:val="0"/>
+          <w:numId w:val="1002"/>
+        </w:numPr>
+      </w:pPr>
+      <w:r>
+        <w:t xml:space="preserve">Regular team standups and mentoring of developers</w:t>
+      </w:r>
+    </w:p>
+    <w:p>
+      <w:pPr>
+        <w:numPr>
+          <w:ilvl w:val="0"/>
+          <w:numId w:val="1002"/>
+        </w:numPr>
+      </w:pPr>
+      <w:r>
+        <w:t xml:space="preserve">Chaired the Giveback Committee, an employee-managed group that coordinated and scheduled volunteer activities for Merchology employees. Collectively we volunteered over 1000 hours in 2023</w:t>
+      </w:r>
+    </w:p>
+    <w:bookmarkEnd w:id="28"/>
+    <w:bookmarkStart w:id="30" w:name="Xc99d62aa1db9ad280ff3cb3d71c3832734cec55"/>
+    <w:p>
+      <w:pPr>
+        <w:pStyle w:val="Heading4"/>
+      </w:pPr>
+      <w:r>
+        <w:t xml:space="preserve">September 2021 - February 2022 | Full Stack WordPress Developer |</w:t>
+      </w:r>
+      <w:r>
+        <w:t xml:space="preserve"> </w:t>
+      </w:r>
+      <w:hyperlink r:id="rId29">
+        <w:r>
+          <w:rPr>
+            <w:rStyle w:val="Hyperlink"/>
+          </w:rPr>
+          <w:t xml:space="preserve">PeTA Foundation</w:t>
+        </w:r>
+      </w:hyperlink>
+      <w:r>
+        <w:t xml:space="preserve"> </w:t>
+      </w:r>
+      <w:r>
+        <w:t xml:space="preserve">| Remote</w:t>
+      </w:r>
+    </w:p>
+    <w:p>
+      <w:pPr>
+        <w:numPr>
+          <w:ilvl w:val="0"/>
+          <w:numId w:val="1003"/>
+        </w:numPr>
+      </w:pPr>
+      <w:r>
+        <w:t xml:space="preserve">Authored custom WordPress and WooCommerce themes, front- and back-end</w:t>
+      </w:r>
+    </w:p>
+    <w:p>
+      <w:pPr>
+        <w:numPr>
+          <w:ilvl w:val="0"/>
+          <w:numId w:val="1003"/>
+        </w:numPr>
+      </w:pPr>
+      <w:r>
+        <w:t xml:space="preserve">WordPress plugin development</w:t>
+      </w:r>
+    </w:p>
+    <w:p>
+      <w:pPr>
+        <w:numPr>
+          <w:ilvl w:val="0"/>
+          <w:numId w:val="1003"/>
+        </w:numPr>
+      </w:pPr>
+      <w:r>
+        <w:t xml:space="preserve">Deployments using Webistrano and GitHub Actions</w:t>
+      </w:r>
+    </w:p>
+    <w:bookmarkEnd w:id="30"/>
+    <w:bookmarkStart w:id="32" w:name="X83ff053c4cc9df63545f397ff8ca4f59e079af3"/>
+    <w:p>
+      <w:pPr>
+        <w:pStyle w:val="Heading4"/>
+      </w:pPr>
+      <w:r>
+        <w:t xml:space="preserve">May 2021 - September 2021 | Full Stack WordPress Developer, Shopify Developer |</w:t>
+      </w:r>
+      <w:r>
+        <w:t xml:space="preserve"> </w:t>
+      </w:r>
+      <w:hyperlink r:id="rId31">
+        <w:r>
+          <w:rPr>
+            <w:rStyle w:val="Hyperlink"/>
+          </w:rPr>
+          <w:t xml:space="preserve">R/West</w:t>
+        </w:r>
+      </w:hyperlink>
+      <w:r>
+        <w:t xml:space="preserve"> </w:t>
+      </w:r>
+      <w:r>
+        <w:t xml:space="preserve">| Remote</w:t>
+      </w:r>
+    </w:p>
+    <w:p>
+      <w:pPr>
+        <w:numPr>
+          <w:ilvl w:val="0"/>
+          <w:numId w:val="1004"/>
+        </w:numPr>
+      </w:pPr>
+      <w:r>
+        <w:t xml:space="preserve">Authored custom WordPress plugins</w:t>
+      </w:r>
+    </w:p>
+    <w:p>
+      <w:pPr>
+        <w:numPr>
+          <w:ilvl w:val="0"/>
+          <w:numId w:val="1004"/>
+        </w:numPr>
+      </w:pPr>
+      <w:r>
+        <w:t xml:space="preserve">Authored custom WordPress themes, front- and back-end development</w:t>
+      </w:r>
+    </w:p>
+    <w:p>
+      <w:pPr>
+        <w:numPr>
+          <w:ilvl w:val="0"/>
+          <w:numId w:val="1004"/>
+        </w:numPr>
+      </w:pPr>
+      <w:r>
+        <w:t xml:space="preserve">Shopify cart and admin customizer development. Custom SVG and CSS animations in the Shopify checkout for volume discount pricing</w:t>
+      </w:r>
+    </w:p>
+    <w:bookmarkEnd w:id="32"/>
+    <w:bookmarkStart w:id="34" w:name="X99afc1a4663a6142ca0ccccd9e1d58562ebe64e"/>
+    <w:p>
+      <w:pPr>
+        <w:pStyle w:val="Heading4"/>
+      </w:pPr>
+      <w:r>
+        <w:t xml:space="preserve">March 2020 - April 2021 | Full Stack WordPress Developer |</w:t>
+      </w:r>
+      <w:r>
+        <w:t xml:space="preserve"> </w:t>
+      </w:r>
+      <w:hyperlink r:id="rId33">
+        <w:r>
+          <w:rPr>
+            <w:rStyle w:val="Hyperlink"/>
+          </w:rPr>
+          <w:t xml:space="preserve">Midwest Dental</w:t>
+        </w:r>
+      </w:hyperlink>
+      <w:r>
+        <w:t xml:space="preserve"> </w:t>
+      </w:r>
+      <w:r>
+        <w:t xml:space="preserve">| Bloomington, Minnesota</w:t>
+      </w:r>
+    </w:p>
+    <w:p>
+      <w:pPr>
+        <w:numPr>
+          <w:ilvl w:val="0"/>
+          <w:numId w:val="1005"/>
+        </w:numPr>
+      </w:pPr>
+      <w:r>
+        <w:t xml:space="preserve">Authored custom WordPress plugins</w:t>
+      </w:r>
+    </w:p>
+    <w:p>
+      <w:pPr>
+        <w:numPr>
+          <w:ilvl w:val="0"/>
+          <w:numId w:val="1005"/>
+        </w:numPr>
+      </w:pPr>
+      <w:r>
+        <w:t xml:space="preserve">WordPress front- and back-end theme development for network of websites</w:t>
+      </w:r>
+    </w:p>
+    <w:p>
+      <w:pPr>
+        <w:numPr>
+          <w:ilvl w:val="0"/>
+          <w:numId w:val="1005"/>
+        </w:numPr>
+      </w:pPr>
+      <w:r>
+        <w:t xml:space="preserve">Front-end development work</w:t>
+      </w:r>
+    </w:p>
+    <w:p>
+      <w:pPr>
+        <w:numPr>
+          <w:ilvl w:val="0"/>
+          <w:numId w:val="1005"/>
+        </w:numPr>
+      </w:pPr>
+      <w:r>
+        <w:t xml:space="preserve">Server, application, and database maintenance</w:t>
+      </w:r>
+    </w:p>
+    <w:p>
+      <w:pPr>
+        <w:numPr>
+          <w:ilvl w:val="0"/>
+          <w:numId w:val="1005"/>
+        </w:numPr>
+      </w:pPr>
+      <w:r>
+        <w:t xml:space="preserve">Integrated and updated call center PHP application</w:t>
+      </w:r>
+    </w:p>
+    <w:p>
+      <w:pPr>
+        <w:numPr>
+          <w:ilvl w:val="0"/>
+          <w:numId w:val="1005"/>
+        </w:numPr>
+      </w:pPr>
+      <w:r>
+        <w:t xml:space="preserve">Coded and implemented marketing emails</w:t>
+      </w:r>
+    </w:p>
+    <w:p>
+      <w:pPr>
+        <w:numPr>
+          <w:ilvl w:val="0"/>
+          <w:numId w:val="1005"/>
+        </w:numPr>
+      </w:pPr>
+      <w:r>
+        <w:t xml:space="preserve">Upgraded sendgrid email security, spam filtering, and cloudflare integration</w:t>
+      </w:r>
+    </w:p>
+    <w:bookmarkEnd w:id="34"/>
+    <w:bookmarkStart w:id="36" w:name="Xf8bbd185db38135883e8f6b6038b28884d34b89"/>
+    <w:p>
+      <w:pPr>
+        <w:pStyle w:val="Heading4"/>
+      </w:pPr>
+      <w:r>
+        <w:t xml:space="preserve">June 2019 - February 2020 | Web Developer |</w:t>
+      </w:r>
+      <w:r>
+        <w:t xml:space="preserve"> </w:t>
+      </w:r>
+      <w:hyperlink r:id="rId35">
+        <w:r>
+          <w:rPr>
+            <w:rStyle w:val="Hyperlink"/>
+          </w:rPr>
+          <w:t xml:space="preserve">Enesco</w:t>
+        </w:r>
+      </w:hyperlink>
+      <w:r>
+        <w:t xml:space="preserve">, Eden Prairie, Minnesota</w:t>
+      </w:r>
+    </w:p>
+    <w:p>
+      <w:pPr>
+        <w:numPr>
+          <w:ilvl w:val="0"/>
+          <w:numId w:val="1006"/>
+        </w:numPr>
+      </w:pPr>
+      <w:r>
+        <w:t xml:space="preserve">Shopify ecommerce theme customization for multiple sites</w:t>
+      </w:r>
+    </w:p>
+    <w:p>
+      <w:pPr>
+        <w:numPr>
+          <w:ilvl w:val="0"/>
+          <w:numId w:val="1006"/>
+        </w:numPr>
+      </w:pPr>
+      <w:r>
+        <w:t xml:space="preserve">PHP development for Shopify API data pipeline to PeopleSoft database</w:t>
+      </w:r>
+    </w:p>
+    <w:p>
+      <w:pPr>
+        <w:numPr>
+          <w:ilvl w:val="0"/>
+          <w:numId w:val="1006"/>
+        </w:numPr>
+      </w:pPr>
+      <w:r>
+        <w:t xml:space="preserve">Multiple website maintenance</w:t>
+      </w:r>
+    </w:p>
+    <w:bookmarkEnd w:id="36"/>
+    <w:bookmarkStart w:id="42" w:name="Xce0ae9efcef2b6cb300459853c4c46c087b5478"/>
+    <w:p>
+      <w:pPr>
+        <w:pStyle w:val="Heading4"/>
+      </w:pPr>
+      <w:r>
+        <w:t xml:space="preserve">April 2016 - February 2019 | Web Developer |</w:t>
+      </w:r>
+      <w:r>
+        <w:t xml:space="preserve"> </w:t>
+      </w:r>
+      <w:hyperlink r:id="rId37">
         <w:r>
           <w:rPr>
             <w:rStyle w:val="Hyperlink"/>
@@ -133,711 +740,11 @@
           <w:t xml:space="preserve">Granicus</w:t>
         </w:r>
       </w:hyperlink>
-    </w:p>
-    <w:p>
-      <w:pPr>
-        <w:numPr>
-          <w:ilvl w:val="0"/>
-          <w:numId w:val="1001"/>
-        </w:numPr>
-        <w:pStyle w:val="Compact"/>
-      </w:pPr>
-      <w:hyperlink r:id="rId26">
-        <w:r>
-          <w:rPr>
-            <w:rStyle w:val="Hyperlink"/>
-          </w:rPr>
-          <w:t xml:space="preserve">Govloop</w:t>
-        </w:r>
-      </w:hyperlink>
-    </w:p>
-    <w:p>
-      <w:pPr>
-        <w:numPr>
-          <w:ilvl w:val="0"/>
-          <w:numId w:val="1001"/>
-        </w:numPr>
-        <w:pStyle w:val="Compact"/>
-      </w:pPr>
-      <w:hyperlink r:id="rId27">
-        <w:r>
-          <w:rPr>
-            <w:rStyle w:val="Hyperlink"/>
-          </w:rPr>
-          <w:t xml:space="preserve">Raleigh Fireplace</w:t>
-        </w:r>
-      </w:hyperlink>
-    </w:p>
-    <w:p>
-      <w:pPr>
-        <w:numPr>
-          <w:ilvl w:val="0"/>
-          <w:numId w:val="1001"/>
-        </w:numPr>
-        <w:pStyle w:val="Compact"/>
-      </w:pPr>
-      <w:hyperlink r:id="rId28">
-        <w:r>
-          <w:rPr>
-            <w:rStyle w:val="Hyperlink"/>
-          </w:rPr>
-          <w:t xml:space="preserve">Martin Law Offices</w:t>
-        </w:r>
-      </w:hyperlink>
-    </w:p>
-    <w:p>
-      <w:pPr>
-        <w:numPr>
-          <w:ilvl w:val="0"/>
-          <w:numId w:val="1001"/>
-        </w:numPr>
-        <w:pStyle w:val="Compact"/>
-      </w:pPr>
-      <w:hyperlink r:id="rId29">
-        <w:r>
-          <w:rPr>
-            <w:rStyle w:val="Hyperlink"/>
-          </w:rPr>
-          <w:t xml:space="preserve">1000 Stories Wine Locator</w:t>
-        </w:r>
-      </w:hyperlink>
-    </w:p>
-    <w:p>
-      <w:pPr>
-        <w:numPr>
-          <w:ilvl w:val="0"/>
-          <w:numId w:val="1001"/>
-        </w:numPr>
-        <w:pStyle w:val="Compact"/>
-      </w:pPr>
-      <w:hyperlink r:id="rId30">
-        <w:r>
-          <w:rPr>
-            <w:rStyle w:val="Hyperlink"/>
-          </w:rPr>
-          <w:t xml:space="preserve">Peta Store</w:t>
-        </w:r>
-      </w:hyperlink>
-    </w:p>
-    <w:p>
-      <w:pPr>
-        <w:numPr>
-          <w:ilvl w:val="0"/>
-          <w:numId w:val="1001"/>
-        </w:numPr>
-        <w:pStyle w:val="Compact"/>
-      </w:pPr>
-      <w:hyperlink r:id="rId31">
-        <w:r>
-          <w:rPr>
-            <w:rStyle w:val="Hyperlink"/>
-          </w:rPr>
-          <w:t xml:space="preserve">Evestar</w:t>
-        </w:r>
-      </w:hyperlink>
-    </w:p>
-    <w:p>
-      <w:pPr>
-        <w:numPr>
-          <w:ilvl w:val="0"/>
-          <w:numId w:val="1001"/>
-        </w:numPr>
-        <w:pStyle w:val="Compact"/>
-      </w:pPr>
-      <w:hyperlink r:id="rId32">
-        <w:r>
-          <w:rPr>
-            <w:rStyle w:val="Hyperlink"/>
-          </w:rPr>
-          <w:t xml:space="preserve">Kitties!</w:t>
-        </w:r>
-      </w:hyperlink>
-      <w:r>
-        <w:t xml:space="preserve"> </w:t>
-      </w:r>
-      <w:r>
-        <w:t xml:space="preserve">personal site</w:t>
-      </w:r>
-    </w:p>
-    <w:p>
-      <w:pPr>
-        <w:numPr>
-          <w:ilvl w:val="0"/>
-          <w:numId w:val="1001"/>
-        </w:numPr>
-        <w:pStyle w:val="Compact"/>
-      </w:pPr>
-      <w:hyperlink r:id="rId33">
-        <w:r>
-          <w:rPr>
-            <w:rStyle w:val="Hyperlink"/>
-          </w:rPr>
-          <w:t xml:space="preserve">Miller Consulting</w:t>
-        </w:r>
-      </w:hyperlink>
-      <w:r>
-        <w:t xml:space="preserve"> </w:t>
-      </w:r>
-      <w:r>
-        <w:t xml:space="preserve">work in progress</w:t>
-      </w:r>
-    </w:p>
-    <w:bookmarkEnd w:id="34"/>
-    <w:bookmarkStart w:id="37" w:name="shopify"/>
-    <w:p>
-      <w:pPr>
-        <w:pStyle w:val="Heading3"/>
-      </w:pPr>
-      <w:r>
-        <w:t xml:space="preserve">Shopify:</w:t>
-      </w:r>
-    </w:p>
-    <w:p>
-      <w:pPr>
-        <w:numPr>
-          <w:ilvl w:val="0"/>
-          <w:numId w:val="1002"/>
-        </w:numPr>
-        <w:pStyle w:val="Compact"/>
-      </w:pPr>
-      <w:hyperlink r:id="rId35">
-        <w:r>
-          <w:rPr>
-            <w:rStyle w:val="Hyperlink"/>
-          </w:rPr>
-          <w:t xml:space="preserve">BouGear</w:t>
-        </w:r>
-      </w:hyperlink>
-    </w:p>
-    <w:p>
-      <w:pPr>
-        <w:numPr>
-          <w:ilvl w:val="0"/>
-          <w:numId w:val="1002"/>
-        </w:numPr>
-        <w:pStyle w:val="Compact"/>
-      </w:pPr>
-      <w:hyperlink r:id="rId36">
-        <w:r>
-          <w:rPr>
-            <w:rStyle w:val="Hyperlink"/>
-          </w:rPr>
-          <w:t xml:space="preserve">Merchology</w:t>
-        </w:r>
-      </w:hyperlink>
-    </w:p>
-    <w:bookmarkEnd w:id="37"/>
-    <w:bookmarkStart w:id="38" w:name="technical-proficiencies"/>
-    <w:p>
-      <w:pPr>
-        <w:pStyle w:val="Heading3"/>
-      </w:pPr>
-      <w:r>
-        <w:rPr>
-          <w:bCs/>
-          <w:b/>
-        </w:rPr>
-        <w:t xml:space="preserve">Technical Proficiencies</w:t>
-      </w:r>
-    </w:p>
-    <w:p>
-      <w:pPr>
-        <w:pStyle w:val="FirstParagraph"/>
-      </w:pPr>
-      <w:r>
-        <w:rPr>
-          <w:bCs/>
-          <w:b/>
-        </w:rPr>
-        <w:t xml:space="preserve">Languages and markup</w:t>
-      </w:r>
-      <w:r>
-        <w:t xml:space="preserve"> </w:t>
-      </w:r>
-      <w:r>
-        <w:t xml:space="preserve">JavaScript, TypeScript, Python, PHP, Liquid, HTML, CSS/SASS/LESS, XML, JSON, YAML, Bash/ZSH, markdown, Perl, MongoDB, MySQL/MariaDB, SVG, GraphQL, VB</w:t>
-      </w:r>
-      <w:r>
-        <w:br/>
-      </w:r>
-      <w:r>
-        <w:rPr>
-          <w:bCs/>
-          <w:b/>
-        </w:rPr>
-        <w:t xml:space="preserve">Cloud Platforms</w:t>
-      </w:r>
-      <w:r>
-        <w:t xml:space="preserve"> </w:t>
-      </w:r>
-      <w:r>
-        <w:t xml:space="preserve">Azure App Service, Azure DevOps, Digital Ocean, Heroku</w:t>
-      </w:r>
-      <w:r>
-        <w:br/>
-      </w:r>
-      <w:r>
-        <w:rPr>
-          <w:bCs/>
-          <w:b/>
-        </w:rPr>
-        <w:t xml:space="preserve">Frameworks/Libraries</w:t>
-      </w:r>
-      <w:r>
-        <w:t xml:space="preserve"> </w:t>
-      </w:r>
-      <w:r>
-        <w:t xml:space="preserve">Bootstrap, Foundation, Tailwind, Rivet (Indiana University CSS framework), Laravel, Magento, Node.js, React, ACF, Gutenberg, jQuery, d3.js, Highcharts</w:t>
-      </w:r>
-      <w:r>
-        <w:br/>
-      </w:r>
-      <w:r>
-        <w:rPr>
-          <w:bCs/>
-          <w:b/>
-        </w:rPr>
-        <w:t xml:space="preserve">Tools/CLI</w:t>
-      </w:r>
-      <w:r>
-        <w:t xml:space="preserve"> </w:t>
-      </w:r>
-      <w:r>
-        <w:t xml:space="preserve">git CLI, npm, yarn, Bower, Composer, Grunt, Gulp, Webpack, Vite, pip, Axios, Express, Bluebird, sed, awk, scp, rsync, ssh, vi, grep, cron, etc., Shopify CLI and APIs, WP-CLI, GitHub Actions, regex, Docker, REST, SOAP</w:t>
-      </w:r>
-      <w:r>
-        <w:br/>
-      </w:r>
-      <w:r>
-        <w:rPr>
-          <w:bCs/>
-          <w:b/>
-        </w:rPr>
-        <w:t xml:space="preserve">Software</w:t>
-      </w:r>
-      <w:r>
-        <w:t xml:space="preserve"> </w:t>
-      </w:r>
-      <w:r>
-        <w:t xml:space="preserve">Adobe Creative Suite, SharePoint, Figma, Jira, GitHub, HubSpot, Salesforce, Marketo, Eloqua, Apache, Nginx, VSCode, GA4, GSC, GTM</w:t>
-      </w:r>
-      <w:r>
-        <w:br/>
-      </w:r>
-      <w:r>
-        <w:rPr>
-          <w:bCs/>
-          <w:b/>
-        </w:rPr>
-        <w:t xml:space="preserve">OS</w:t>
-      </w:r>
-      <w:r>
-        <w:t xml:space="preserve"> </w:t>
-      </w:r>
-      <w:r>
-        <w:t xml:space="preserve">CentOS, Fedora, RHEL, Ubuntu, Debian, Raspbian, MacOS, Windows</w:t>
-      </w:r>
-      <w:r>
-        <w:br/>
-      </w:r>
-      <w:r>
-        <w:rPr>
-          <w:bCs/>
-          <w:b/>
-        </w:rPr>
-        <w:t xml:space="preserve">CMS/EComm</w:t>
-      </w:r>
-      <w:r>
-        <w:t xml:space="preserve"> </w:t>
-      </w:r>
-      <w:r>
-        <w:t xml:space="preserve">WordPress, WooCommerce, Magento, Shopify, Cascade</w:t>
-      </w:r>
-      <w:r>
-        <w:br/>
-      </w:r>
-      <w:r>
-        <w:rPr>
-          <w:bCs/>
-          <w:b/>
-        </w:rPr>
-        <w:t xml:space="preserve">Other Skills</w:t>
-      </w:r>
-      <w:r>
-        <w:t xml:space="preserve"> </w:t>
-      </w:r>
-      <w:r>
-        <w:t xml:space="preserve">SVG, CSS, and JavaScript Animation, a11y/WCAG compliant coding practices, clear communicator, Agile/Scrum</w:t>
-      </w:r>
-    </w:p>
-    <w:bookmarkEnd w:id="38"/>
-    <w:bookmarkStart w:id="59" w:name="professional-experiences"/>
-    <w:p>
-      <w:pPr>
-        <w:pStyle w:val="Heading3"/>
-      </w:pPr>
-      <w:r>
-        <w:rPr>
-          <w:bCs/>
-          <w:b/>
-        </w:rPr>
-        <w:t xml:space="preserve">Professional Experiences</w:t>
-      </w:r>
-    </w:p>
-    <w:bookmarkStart w:id="40" w:name="X6ae874e2bc6bc97ddc985f77c3f122a88b65921"/>
-    <w:p>
-      <w:pPr>
-        <w:pStyle w:val="Heading4"/>
-      </w:pPr>
-      <w:r>
-        <w:t xml:space="preserve">March 17, 2025 - September 17, 2025 | Web Developer |</w:t>
-      </w:r>
-      <w:r>
-        <w:t xml:space="preserve"> </w:t>
-      </w:r>
-      <w:hyperlink r:id="rId39">
-        <w:r>
-          <w:rPr>
-            <w:rStyle w:val="Hyperlink"/>
-          </w:rPr>
-          <w:t xml:space="preserve">Indiana University</w:t>
-        </w:r>
-      </w:hyperlink>
-      <w:r>
-        <w:t xml:space="preserve">, Bloomington, Indiana (remote contract)</w:t>
-      </w:r>
-    </w:p>
-    <w:p>
-      <w:pPr>
-        <w:numPr>
-          <w:ilvl w:val="0"/>
-          <w:numId w:val="1003"/>
-        </w:numPr>
-      </w:pPr>
-      <w:r>
-        <w:t xml:space="preserve">Developed bespoke reusable extensions for IU website(s) CMS (Cascade) for frontend display, using Velocity, HTML/CSS, XML, PHP, JavaScript, MS-SDK, MicroSoft Graph API, custom css for Highcharts animations</w:t>
-      </w:r>
-    </w:p>
-    <w:p>
-      <w:pPr>
-        <w:numPr>
-          <w:ilvl w:val="0"/>
-          <w:numId w:val="1003"/>
-        </w:numPr>
-      </w:pPr>
-      <w:r>
-        <w:t xml:space="preserve">Extensions included dynamic data visualization (Highcharts), WordPress blog feeds, SharePoint Lists (Azure MicroSoft Graph API and MS-SDK), LiveWhale Feeds (Calendars), dynamic custom JavaScript filters, and IU-hosted web framework automations</w:t>
-      </w:r>
-    </w:p>
-    <w:p>
-      <w:pPr>
-        <w:numPr>
-          <w:ilvl w:val="0"/>
-          <w:numId w:val="1003"/>
-        </w:numPr>
-      </w:pPr>
-      <w:r>
-        <w:t xml:space="preserve">Architected extension components best practices for implementation</w:t>
-      </w:r>
-    </w:p>
-    <w:p>
-      <w:pPr>
-        <w:numPr>
-          <w:ilvl w:val="0"/>
-          <w:numId w:val="1003"/>
-        </w:numPr>
-      </w:pPr>
-      <w:r>
-        <w:t xml:space="preserve">Extensive use of github actions and CI/CD deployment automations</w:t>
-      </w:r>
-    </w:p>
-    <w:bookmarkEnd w:id="40"/>
-    <w:bookmarkStart w:id="43" w:name="X09125dd8110e86f8a73dfa2213386985892994f"/>
-    <w:p>
-      <w:pPr>
-        <w:pStyle w:val="Heading4"/>
-      </w:pPr>
-      <w:r>
-        <w:t xml:space="preserve">March 2024 - September 2024 | Lead Web Developer |</w:t>
-      </w:r>
-      <w:r>
-        <w:t xml:space="preserve"> </w:t>
-      </w:r>
-      <w:hyperlink r:id="rId41">
-        <w:r>
-          <w:rPr>
-            <w:rStyle w:val="Hyperlink"/>
-          </w:rPr>
-          <w:t xml:space="preserve">Merchology</w:t>
-        </w:r>
-      </w:hyperlink>
-      <w:r>
-        <w:t xml:space="preserve">, Plymouth, Minnesota</w:t>
-      </w:r>
-    </w:p>
-    <w:p>
-      <w:pPr>
-        <w:numPr>
-          <w:ilvl w:val="0"/>
-          <w:numId w:val="1004"/>
-        </w:numPr>
-      </w:pPr>
-      <w:r>
-        <w:t xml:space="preserve">Custom Shopify theme development for bespoke storefronts, including</w:t>
-      </w:r>
-      <w:r>
-        <w:t xml:space="preserve"> </w:t>
-      </w:r>
-      <w:hyperlink r:id="rId42">
-        <w:r>
-          <w:rPr>
-            <w:rStyle w:val="Hyperlink"/>
-          </w:rPr>
-          <w:t xml:space="preserve">BouGear</w:t>
-        </w:r>
-      </w:hyperlink>
-    </w:p>
-    <w:p>
-      <w:pPr>
-        <w:numPr>
-          <w:ilvl w:val="0"/>
-          <w:numId w:val="1004"/>
-        </w:numPr>
-      </w:pPr>
-      <w:r>
-        <w:t xml:space="preserve">Extensive usage of the Shopify Storefront and Admin APIs using a GraphQL interface</w:t>
-      </w:r>
-    </w:p>
-    <w:p>
-      <w:pPr>
-        <w:numPr>
-          <w:ilvl w:val="0"/>
-          <w:numId w:val="1004"/>
-        </w:numPr>
-      </w:pPr>
-      <w:r>
-        <w:t xml:space="preserve">Code maintenance, refactoring, documentation, and debugging. Overall reduction of technical debt</w:t>
-      </w:r>
-    </w:p>
-    <w:p>
-      <w:pPr>
-        <w:numPr>
-          <w:ilvl w:val="0"/>
-          <w:numId w:val="1004"/>
-        </w:numPr>
-      </w:pPr>
-      <w:r>
-        <w:t xml:space="preserve">Development of new website features and implemented a new UI, which led to an increase in conversions. Developed bespoke SVG and CSS animations for product selection and shipping options</w:t>
-      </w:r>
-    </w:p>
-    <w:p>
-      <w:pPr>
-        <w:numPr>
-          <w:ilvl w:val="0"/>
-          <w:numId w:val="1004"/>
-        </w:numPr>
-      </w:pPr>
-      <w:r>
-        <w:t xml:space="preserve">Developer team leadership and management, conducted reviews, stand-ups, and regular 1:1 meetings</w:t>
-      </w:r>
-    </w:p>
-    <w:p>
-      <w:pPr>
-        <w:numPr>
-          <w:ilvl w:val="0"/>
-          <w:numId w:val="1004"/>
-        </w:numPr>
-      </w:pPr>
-      <w:r>
-        <w:t xml:space="preserve">Through website improvements my efforts increased sales efficiency, reduced customer friction, and assisted sales growth from $50M to $72M over a two-year period</w:t>
-      </w:r>
-    </w:p>
-    <w:p>
-      <w:pPr>
-        <w:numPr>
-          <w:ilvl w:val="0"/>
-          <w:numId w:val="1004"/>
-        </w:numPr>
-      </w:pPr>
-      <w:r>
-        <w:t xml:space="preserve">Submitted and completed over 1000 Jira tickets during my tenure at Merchology</w:t>
-      </w:r>
-    </w:p>
-    <w:p>
-      <w:pPr>
-        <w:numPr>
-          <w:ilvl w:val="0"/>
-          <w:numId w:val="1004"/>
-        </w:numPr>
-      </w:pPr>
-      <w:r>
-        <w:t xml:space="preserve">Regular team standups and mentoring of developers</w:t>
-      </w:r>
-    </w:p>
-    <w:p>
-      <w:pPr>
-        <w:numPr>
-          <w:ilvl w:val="0"/>
-          <w:numId w:val="1004"/>
-        </w:numPr>
-      </w:pPr>
-      <w:r>
-        <w:t xml:space="preserve">Chaired the Giveback Committee, an employee-managed group that coordinated and scheduled volunteer activities for Merchology employees. Collectively we volunteered over 1000 hours in 2023</w:t>
-      </w:r>
-    </w:p>
-    <w:bookmarkEnd w:id="43"/>
-    <w:bookmarkStart w:id="44" w:name="Xd31fea270e5ee91b25f5a91e2c7b042eb774c2e"/>
-    <w:p>
-      <w:pPr>
-        <w:pStyle w:val="Heading4"/>
-      </w:pPr>
-      <w:r>
-        <w:t xml:space="preserve">April 2022 - March 2024 | Senior Web Developer |</w:t>
-      </w:r>
-      <w:r>
-        <w:t xml:space="preserve"> </w:t>
-      </w:r>
-      <w:hyperlink r:id="rId41">
-        <w:r>
-          <w:rPr>
-            <w:rStyle w:val="Hyperlink"/>
-          </w:rPr>
-          <w:t xml:space="preserve">Merchology</w:t>
-        </w:r>
-      </w:hyperlink>
-      <w:r>
-        <w:t xml:space="preserve">, Plymouth, Minnesota</w:t>
-      </w:r>
-    </w:p>
-    <w:p>
-      <w:pPr>
-        <w:numPr>
-          <w:ilvl w:val="0"/>
-          <w:numId w:val="1005"/>
-        </w:numPr>
-      </w:pPr>
-      <w:r>
-        <w:t xml:space="preserve">Custom Shopify theme development</w:t>
-      </w:r>
-    </w:p>
-    <w:p>
-      <w:pPr>
-        <w:numPr>
-          <w:ilvl w:val="0"/>
-          <w:numId w:val="1005"/>
-        </w:numPr>
-      </w:pPr>
-      <w:r>
-        <w:t xml:space="preserve">Code maintenance and debugging</w:t>
-      </w:r>
-    </w:p>
-    <w:p>
-      <w:pPr>
-        <w:numPr>
-          <w:ilvl w:val="0"/>
-          <w:numId w:val="1005"/>
-        </w:numPr>
-      </w:pPr>
-      <w:r>
-        <w:t xml:space="preserve">Development of new internal features for the sales department and external customers</w:t>
-      </w:r>
-    </w:p>
-    <w:p>
-      <w:pPr>
-        <w:numPr>
-          <w:ilvl w:val="0"/>
-          <w:numId w:val="1005"/>
-        </w:numPr>
-      </w:pPr>
-      <w:r>
-        <w:t xml:space="preserve">Improved internal processes by implementing a GitHub code repository and GitHub Actions for the Merchandising Department’s code updates (pricing scripts, product tag management, global variables)</w:t>
-      </w:r>
-    </w:p>
-    <w:bookmarkEnd w:id="44"/>
-    <w:bookmarkStart w:id="46" w:name="Xc99d62aa1db9ad280ff3cb3d71c3832734cec55"/>
-    <w:p>
-      <w:pPr>
-        <w:pStyle w:val="Heading4"/>
-      </w:pPr>
-      <w:r>
-        <w:t xml:space="preserve">September 2021 - February 2022 | Full Stack WordPress Developer |</w:t>
-      </w:r>
-      <w:r>
-        <w:t xml:space="preserve"> </w:t>
-      </w:r>
-      <w:hyperlink r:id="rId45">
-        <w:r>
-          <w:rPr>
-            <w:rStyle w:val="Hyperlink"/>
-          </w:rPr>
-          <w:t xml:space="preserve">PeTA Foundation</w:t>
-        </w:r>
-      </w:hyperlink>
-      <w:r>
-        <w:t xml:space="preserve"> </w:t>
-      </w:r>
-      <w:r>
-        <w:t xml:space="preserve">| Remote</w:t>
-      </w:r>
-    </w:p>
-    <w:p>
-      <w:pPr>
-        <w:numPr>
-          <w:ilvl w:val="0"/>
-          <w:numId w:val="1006"/>
-        </w:numPr>
-      </w:pPr>
-      <w:r>
-        <w:t xml:space="preserve">Authored custom WordPress and WooCommerce themes, front- and back-end</w:t>
-      </w:r>
-    </w:p>
-    <w:p>
-      <w:pPr>
-        <w:numPr>
-          <w:ilvl w:val="0"/>
-          <w:numId w:val="1006"/>
-        </w:numPr>
-      </w:pPr>
-      <w:r>
-        <w:t xml:space="preserve">WordPress plugin development</w:t>
-      </w:r>
-    </w:p>
-    <w:p>
-      <w:pPr>
-        <w:numPr>
-          <w:ilvl w:val="0"/>
-          <w:numId w:val="1006"/>
-        </w:numPr>
-      </w:pPr>
-      <w:r>
-        <w:t xml:space="preserve">Deployments using Webistrano and GitHub Actions</w:t>
-      </w:r>
-    </w:p>
-    <w:bookmarkEnd w:id="46"/>
-    <w:bookmarkStart w:id="48" w:name="X83ff053c4cc9df63545f397ff8ca4f59e079af3"/>
-    <w:p>
-      <w:pPr>
-        <w:pStyle w:val="Heading4"/>
-      </w:pPr>
-      <w:r>
-        <w:t xml:space="preserve">May 2021 - September 2021 | Full Stack WordPress Developer, Shopify Developer |</w:t>
-      </w:r>
-      <w:r>
-        <w:t xml:space="preserve"> </w:t>
-      </w:r>
-      <w:hyperlink r:id="rId47">
-        <w:r>
-          <w:rPr>
-            <w:rStyle w:val="Hyperlink"/>
-          </w:rPr>
-          <w:t xml:space="preserve">R/West</w:t>
-        </w:r>
-      </w:hyperlink>
-      <w:r>
-        <w:t xml:space="preserve"> </w:t>
-      </w:r>
-      <w:r>
-        <w:t xml:space="preserve">| Remote</w:t>
+      <w:r>
+        <w:t xml:space="preserve"> </w:t>
+      </w:r>
+      <w:r>
+        <w:t xml:space="preserve">| St. Paul, Minnesota</w:t>
       </w:r>
     </w:p>
     <w:p>
@@ -848,233 +755,12 @@
         </w:numPr>
       </w:pPr>
       <w:r>
-        <w:t xml:space="preserve">Authored custom WordPress plugins</w:t>
-      </w:r>
-    </w:p>
-    <w:p>
-      <w:pPr>
-        <w:numPr>
-          <w:ilvl w:val="0"/>
-          <w:numId w:val="1007"/>
-        </w:numPr>
-      </w:pPr>
-      <w:r>
-        <w:t xml:space="preserve">Authored custom WordPress themes, front- and back-end development</w:t>
-      </w:r>
-    </w:p>
-    <w:p>
-      <w:pPr>
-        <w:numPr>
-          <w:ilvl w:val="0"/>
-          <w:numId w:val="1007"/>
-        </w:numPr>
-      </w:pPr>
-      <w:r>
-        <w:t xml:space="preserve">Shopify cart and admin customizer development. Custom SVG and CSS animations in the Shopify checkout for volume discount pricing</w:t>
-      </w:r>
-    </w:p>
-    <w:bookmarkEnd w:id="48"/>
-    <w:bookmarkStart w:id="50" w:name="X99afc1a4663a6142ca0ccccd9e1d58562ebe64e"/>
-    <w:p>
-      <w:pPr>
-        <w:pStyle w:val="Heading4"/>
-      </w:pPr>
-      <w:r>
-        <w:t xml:space="preserve">March 2020 - April 2021 | Full Stack WordPress Developer |</w:t>
-      </w:r>
-      <w:r>
-        <w:t xml:space="preserve"> </w:t>
-      </w:r>
-      <w:hyperlink r:id="rId49">
-        <w:r>
-          <w:rPr>
-            <w:rStyle w:val="Hyperlink"/>
-          </w:rPr>
-          <w:t xml:space="preserve">Midwest Dental</w:t>
-        </w:r>
-      </w:hyperlink>
-      <w:r>
-        <w:t xml:space="preserve"> </w:t>
-      </w:r>
-      <w:r>
-        <w:t xml:space="preserve">| Bloomington, Minnesota</w:t>
-      </w:r>
-    </w:p>
-    <w:p>
-      <w:pPr>
-        <w:numPr>
-          <w:ilvl w:val="0"/>
-          <w:numId w:val="1008"/>
-        </w:numPr>
-      </w:pPr>
-      <w:r>
-        <w:t xml:space="preserve">Authored custom WordPress plugins</w:t>
-      </w:r>
-    </w:p>
-    <w:p>
-      <w:pPr>
-        <w:numPr>
-          <w:ilvl w:val="0"/>
-          <w:numId w:val="1008"/>
-        </w:numPr>
-      </w:pPr>
-      <w:r>
-        <w:t xml:space="preserve">WordPress front- and back-end theme development for network of websites</w:t>
-      </w:r>
-    </w:p>
-    <w:p>
-      <w:pPr>
-        <w:numPr>
-          <w:ilvl w:val="0"/>
-          <w:numId w:val="1008"/>
-        </w:numPr>
-      </w:pPr>
-      <w:r>
-        <w:t xml:space="preserve">Front-end development work</w:t>
-      </w:r>
-    </w:p>
-    <w:p>
-      <w:pPr>
-        <w:numPr>
-          <w:ilvl w:val="0"/>
-          <w:numId w:val="1008"/>
-        </w:numPr>
-      </w:pPr>
-      <w:r>
-        <w:t xml:space="preserve">Server, application, and database maintenance</w:t>
-      </w:r>
-    </w:p>
-    <w:p>
-      <w:pPr>
-        <w:numPr>
-          <w:ilvl w:val="0"/>
-          <w:numId w:val="1008"/>
-        </w:numPr>
-      </w:pPr>
-      <w:r>
-        <w:t xml:space="preserve">Integrated and updated call center PHP application</w:t>
-      </w:r>
-    </w:p>
-    <w:p>
-      <w:pPr>
-        <w:numPr>
-          <w:ilvl w:val="0"/>
-          <w:numId w:val="1008"/>
-        </w:numPr>
-      </w:pPr>
-      <w:r>
-        <w:t xml:space="preserve">Coded and implemented marketing emails</w:t>
-      </w:r>
-    </w:p>
-    <w:p>
-      <w:pPr>
-        <w:numPr>
-          <w:ilvl w:val="0"/>
-          <w:numId w:val="1008"/>
-        </w:numPr>
-      </w:pPr>
-      <w:r>
-        <w:t xml:space="preserve">Upgraded sendgrid email security, spam filtering, and cloudflare integration</w:t>
-      </w:r>
-    </w:p>
-    <w:bookmarkEnd w:id="50"/>
-    <w:bookmarkStart w:id="52" w:name="Xf8bbd185db38135883e8f6b6038b28884d34b89"/>
-    <w:p>
-      <w:pPr>
-        <w:pStyle w:val="Heading4"/>
-      </w:pPr>
-      <w:r>
-        <w:t xml:space="preserve">June 2019 - February 2020 | Web Developer |</w:t>
-      </w:r>
-      <w:r>
-        <w:t xml:space="preserve"> </w:t>
-      </w:r>
-      <w:hyperlink r:id="rId51">
-        <w:r>
-          <w:rPr>
-            <w:rStyle w:val="Hyperlink"/>
-          </w:rPr>
-          <w:t xml:space="preserve">Enesco</w:t>
-        </w:r>
-      </w:hyperlink>
-      <w:r>
-        <w:t xml:space="preserve">, Eden Prairie, Minnesota</w:t>
-      </w:r>
-    </w:p>
-    <w:p>
-      <w:pPr>
-        <w:numPr>
-          <w:ilvl w:val="0"/>
-          <w:numId w:val="1009"/>
-        </w:numPr>
-      </w:pPr>
-      <w:r>
-        <w:t xml:space="preserve">Shopify ecommerce theme customization for multiple sites</w:t>
-      </w:r>
-    </w:p>
-    <w:p>
-      <w:pPr>
-        <w:numPr>
-          <w:ilvl w:val="0"/>
-          <w:numId w:val="1009"/>
-        </w:numPr>
-      </w:pPr>
-      <w:r>
-        <w:t xml:space="preserve">PHP development for Shopify API data pipeline to PeopleSoft database</w:t>
-      </w:r>
-    </w:p>
-    <w:p>
-      <w:pPr>
-        <w:numPr>
-          <w:ilvl w:val="0"/>
-          <w:numId w:val="1009"/>
-        </w:numPr>
-      </w:pPr>
-      <w:r>
-        <w:t xml:space="preserve">Multiple website maintenance</w:t>
-      </w:r>
-    </w:p>
-    <w:bookmarkEnd w:id="52"/>
-    <w:bookmarkStart w:id="56" w:name="Xce0ae9efcef2b6cb300459853c4c46c087b5478"/>
-    <w:p>
-      <w:pPr>
-        <w:pStyle w:val="Heading4"/>
-      </w:pPr>
-      <w:r>
-        <w:t xml:space="preserve">April 2016 - February 2019 | Web Developer |</w:t>
-      </w:r>
-      <w:r>
-        <w:t xml:space="preserve"> </w:t>
-      </w:r>
-      <w:hyperlink r:id="rId53">
-        <w:r>
-          <w:rPr>
-            <w:rStyle w:val="Hyperlink"/>
-          </w:rPr>
-          <w:t xml:space="preserve">Granicus</w:t>
-        </w:r>
-      </w:hyperlink>
-      <w:r>
-        <w:t xml:space="preserve"> </w:t>
-      </w:r>
-      <w:r>
-        <w:t xml:space="preserve">| St. Paul, Minnesota</w:t>
-      </w:r>
-    </w:p>
-    <w:p>
-      <w:pPr>
-        <w:numPr>
-          <w:ilvl w:val="0"/>
-          <w:numId w:val="1010"/>
-        </w:numPr>
-      </w:pPr>
-      <w:r>
         <w:t xml:space="preserve">Developed custom themes, custom plugins, frontend redesign and implementation for</w:t>
       </w:r>
       <w:r>
         <w:t xml:space="preserve"> </w:t>
       </w:r>
-      <w:hyperlink r:id="rId25">
+      <w:hyperlink r:id="rId38">
         <w:r>
           <w:rPr>
             <w:rStyle w:val="Hyperlink"/>
@@ -1088,7 +774,7 @@
       <w:r>
         <w:t xml:space="preserve"> </w:t>
       </w:r>
-      <w:hyperlink r:id="rId54">
+      <w:hyperlink r:id="rId39">
         <w:r>
           <w:rPr>
             <w:rStyle w:val="Hyperlink"/>
@@ -1105,7 +791,7 @@
       <w:r>
         <w:t xml:space="preserve"> </w:t>
       </w:r>
-      <w:hyperlink r:id="rId26">
+      <w:hyperlink r:id="rId40">
         <w:r>
           <w:rPr>
             <w:rStyle w:val="Hyperlink"/>
@@ -1121,7 +807,7 @@
       <w:pPr>
         <w:numPr>
           <w:ilvl w:val="0"/>
-          <w:numId w:val="1010"/>
+          <w:numId w:val="1007"/>
         </w:numPr>
       </w:pPr>
       <w:r>
@@ -1132,7 +818,7 @@
       <w:pPr>
         <w:numPr>
           <w:ilvl w:val="0"/>
-          <w:numId w:val="1010"/>
+          <w:numId w:val="1007"/>
         </w:numPr>
       </w:pPr>
       <w:r>
@@ -1141,7 +827,7 @@
       <w:r>
         <w:t xml:space="preserve"> </w:t>
       </w:r>
-      <w:hyperlink r:id="rId55">
+      <w:hyperlink r:id="rId41">
         <w:r>
           <w:rPr>
             <w:rStyle w:val="Hyperlink"/>
@@ -1157,7 +843,7 @@
       <w:pPr>
         <w:numPr>
           <w:ilvl w:val="0"/>
-          <w:numId w:val="1010"/>
+          <w:numId w:val="1007"/>
         </w:numPr>
       </w:pPr>
       <w:r>
@@ -1168,7 +854,7 @@
       <w:pPr>
         <w:numPr>
           <w:ilvl w:val="0"/>
-          <w:numId w:val="1010"/>
+          <w:numId w:val="1007"/>
         </w:numPr>
       </w:pPr>
       <w:r>
@@ -1179,7 +865,7 @@
       <w:pPr>
         <w:numPr>
           <w:ilvl w:val="0"/>
-          <w:numId w:val="1010"/>
+          <w:numId w:val="1007"/>
         </w:numPr>
       </w:pPr>
       <w:r>
@@ -1190,15 +876,15 @@
       <w:pPr>
         <w:numPr>
           <w:ilvl w:val="0"/>
-          <w:numId w:val="1010"/>
+          <w:numId w:val="1007"/>
         </w:numPr>
       </w:pPr>
       <w:r>
         <w:t xml:space="preserve">Leveraged Marketo to customize front-end forms and landing pages code for the Marketing Department</w:t>
       </w:r>
     </w:p>
-    <w:bookmarkEnd w:id="56"/>
-    <w:bookmarkStart w:id="58" w:name="Xf967a6d77daeb6cfb95950d3103be73a79bdf23"/>
+    <w:bookmarkEnd w:id="42"/>
+    <w:bookmarkStart w:id="44" w:name="Xf967a6d77daeb6cfb95950d3103be73a79bdf23"/>
     <w:p>
       <w:pPr>
         <w:pStyle w:val="Heading4"/>
@@ -1209,7 +895,7 @@
       <w:r>
         <w:t xml:space="preserve"> </w:t>
       </w:r>
-      <w:hyperlink r:id="rId57">
+      <w:hyperlink r:id="rId43">
         <w:r>
           <w:rPr>
             <w:rStyle w:val="Hyperlink"/>
@@ -1228,7 +914,7 @@
       <w:pPr>
         <w:numPr>
           <w:ilvl w:val="0"/>
-          <w:numId w:val="1011"/>
+          <w:numId w:val="1008"/>
         </w:numPr>
       </w:pPr>
       <w:r>
@@ -1239,7 +925,7 @@
       <w:pPr>
         <w:numPr>
           <w:ilvl w:val="0"/>
-          <w:numId w:val="1011"/>
+          <w:numId w:val="1008"/>
         </w:numPr>
       </w:pPr>
       <w:r>
@@ -1250,7 +936,7 @@
       <w:pPr>
         <w:numPr>
           <w:ilvl w:val="0"/>
-          <w:numId w:val="1011"/>
+          <w:numId w:val="1008"/>
         </w:numPr>
       </w:pPr>
       <w:r>
@@ -1261,7 +947,7 @@
       <w:pPr>
         <w:numPr>
           <w:ilvl w:val="0"/>
-          <w:numId w:val="1011"/>
+          <w:numId w:val="1008"/>
         </w:numPr>
       </w:pPr>
       <w:r>
@@ -1272,7 +958,7 @@
       <w:pPr>
         <w:numPr>
           <w:ilvl w:val="0"/>
-          <w:numId w:val="1011"/>
+          <w:numId w:val="1008"/>
         </w:numPr>
       </w:pPr>
       <w:r>
@@ -1283,7 +969,7 @@
       <w:pPr>
         <w:numPr>
           <w:ilvl w:val="0"/>
-          <w:numId w:val="1011"/>
+          <w:numId w:val="1008"/>
         </w:numPr>
       </w:pPr>
       <w:r>
@@ -1302,10 +988,10 @@
         <w:t xml:space="preserve">This document was dynamically generated from a markdown file at https://github.com/m-miller/resume/ via a GitHub Action.</w:t>
       </w:r>
     </w:p>
-    <w:bookmarkEnd w:id="58"/>
-    <w:bookmarkEnd w:id="59"/>
-    <w:bookmarkEnd w:id="60"/>
-    <w:bookmarkEnd w:id="61"/>
+    <w:bookmarkEnd w:id="44"/>
+    <w:bookmarkEnd w:id="45"/>
+    <w:bookmarkEnd w:id="46"/>
+    <w:bookmarkEnd w:id="47"/>
     <w:sectPr/>
   </w:body>
 </w:document>
@@ -1513,15 +1199,6 @@
     <w:abstractNumId w:val="991"/>
   </w:num>
   <w:num w:numId="1008">
-    <w:abstractNumId w:val="991"/>
-  </w:num>
-  <w:num w:numId="1009">
-    <w:abstractNumId w:val="991"/>
-  </w:num>
-  <w:num w:numId="1010">
-    <w:abstractNumId w:val="991"/>
-  </w:num>
-  <w:num w:numId="1011">
     <w:abstractNumId w:val="991"/>
   </w:num>
 </w:numbering>

</xml_diff>